<commit_message>
Add fisheries_and_aquaculture.py Added fisheries_and_aquaculture.py, with functions: - emissions small and large fisheries - coastal aquaculture emissions Also, updated excel reference file
</commit_message>
<xml_diff>
--- a/djangoexact/math_model/excel_reference_version/questions.docx
+++ b/djangoexact/math_model/excel_reference_version/questions.docx
@@ -512,6 +512,143 @@
         </w:rPr>
         <w:t>In COASTAL in cell D79 – D105 always 0, mistake?</w:t>
       </w:r>
+    </w:p>
+    <w:p>
+      <w:pPr>
+        <w:rPr>
+          <w:sz w:val="20"/>
+          <w:szCs w:val="20"/>
+          <w:lang w:val="en-US"/>
+        </w:rPr>
+      </w:pPr>
+    </w:p>
+    <w:p>
+      <w:pPr>
+        <w:rPr>
+          <w:sz w:val="36"/>
+          <w:szCs w:val="36"/>
+          <w:lang w:val="en-US"/>
+        </w:rPr>
+      </w:pPr>
+      <w:r>
+        <w:rPr>
+          <w:sz w:val="36"/>
+          <w:szCs w:val="36"/>
+          <w:lang w:val="en-US"/>
+        </w:rPr>
+        <w:t xml:space="preserve">7. </w:t>
+      </w:r>
+      <w:r>
+        <w:rPr>
+          <w:sz w:val="36"/>
+          <w:szCs w:val="36"/>
+          <w:lang w:val="en-US"/>
+        </w:rPr>
+        <w:t>FISHERIES AND AQUACULTURE</w:t>
+      </w:r>
+    </w:p>
+    <w:p>
+      <w:pPr>
+        <w:rPr>
+          <w:sz w:val="20"/>
+          <w:szCs w:val="20"/>
+          <w:lang w:val="en-US"/>
+        </w:rPr>
+      </w:pPr>
+      <w:r>
+        <w:rPr>
+          <w:sz w:val="20"/>
+          <w:szCs w:val="20"/>
+          <w:lang w:val="en-US"/>
+        </w:rPr>
+        <w:t xml:space="preserve">In </w:t>
+      </w:r>
+      <w:r>
+        <w:rPr>
+          <w:sz w:val="20"/>
+          <w:szCs w:val="20"/>
+          <w:lang w:val="en-US"/>
+        </w:rPr>
+        <w:t>FISH AND AQUA</w:t>
+      </w:r>
+      <w:r>
+        <w:rPr>
+          <w:sz w:val="20"/>
+          <w:szCs w:val="20"/>
+          <w:lang w:val="en-US"/>
+        </w:rPr>
+        <w:t xml:space="preserve"> in </w:t>
+      </w:r>
+      <w:r>
+        <w:rPr>
+          <w:sz w:val="20"/>
+          <w:szCs w:val="20"/>
+          <w:lang w:val="en-US"/>
+        </w:rPr>
+        <w:t xml:space="preserve">cell </w:t>
+      </w:r>
+      <w:r>
+        <w:rPr>
+          <w:sz w:val="20"/>
+          <w:szCs w:val="20"/>
+          <w:lang w:val="en-US"/>
+        </w:rPr>
+        <w:t xml:space="preserve">M63 the formula refers to values in small scale fisheries, whereas for </w:t>
+      </w:r>
+      <w:proofErr w:type="spellStart"/>
+      <w:r>
+        <w:rPr>
+          <w:sz w:val="20"/>
+          <w:szCs w:val="20"/>
+          <w:lang w:val="en-US"/>
+        </w:rPr>
+        <w:t>emissions_wo</w:t>
+      </w:r>
+      <w:proofErr w:type="spellEnd"/>
+      <w:r>
+        <w:rPr>
+          <w:sz w:val="20"/>
+          <w:szCs w:val="20"/>
+          <w:lang w:val="en-US"/>
+        </w:rPr>
+        <w:t xml:space="preserve"> and start it refers to values in large scale fisheries. Clearly a mistake, right?</w:t>
+      </w:r>
+    </w:p>
+    <w:p>
+      <w:pPr>
+        <w:rPr>
+          <w:sz w:val="20"/>
+          <w:szCs w:val="20"/>
+          <w:lang w:val="en-US"/>
+        </w:rPr>
+      </w:pPr>
+    </w:p>
+    <w:p>
+      <w:pPr>
+        <w:rPr>
+          <w:sz w:val="20"/>
+          <w:szCs w:val="20"/>
+          <w:lang w:val="en-US"/>
+        </w:rPr>
+      </w:pPr>
+    </w:p>
+    <w:p>
+      <w:pPr>
+        <w:rPr>
+          <w:sz w:val="36"/>
+          <w:szCs w:val="36"/>
+          <w:lang w:val="en-US"/>
+        </w:rPr>
+      </w:pPr>
+    </w:p>
+    <w:p>
+      <w:pPr>
+        <w:rPr>
+          <w:sz w:val="20"/>
+          <w:szCs w:val="20"/>
+          <w:lang w:val="en-US"/>
+        </w:rPr>
+      </w:pPr>
     </w:p>
     <w:p>
       <w:pPr>

</xml_diff>

<commit_message>
Fix forest_management bgb calculation Also removed prints from the code of other functions
</commit_message>
<xml_diff>
--- a/djangoexact/math_model/excel_reference_version/questions.docx
+++ b/djangoexact/math_model/excel_reference_version/questions.docx
@@ -338,6 +338,130 @@
     <w:p>
       <w:pPr>
         <w:rPr>
+          <w:sz w:val="36"/>
+          <w:szCs w:val="36"/>
+          <w:lang w:val="en-US"/>
+        </w:rPr>
+      </w:pPr>
+      <w:r>
+        <w:rPr>
+          <w:sz w:val="36"/>
+          <w:szCs w:val="36"/>
+          <w:lang w:val="en-US"/>
+        </w:rPr>
+        <w:t>4</w:t>
+      </w:r>
+      <w:r>
+        <w:rPr>
+          <w:sz w:val="36"/>
+          <w:szCs w:val="36"/>
+          <w:lang w:val="en-US"/>
+        </w:rPr>
+        <w:t xml:space="preserve">. </w:t>
+      </w:r>
+      <w:r>
+        <w:rPr>
+          <w:sz w:val="36"/>
+          <w:szCs w:val="36"/>
+          <w:lang w:val="en-US"/>
+        </w:rPr>
+        <w:t>Grassland Management</w:t>
+      </w:r>
+    </w:p>
+    <w:p>
+      <w:pPr>
+        <w:rPr>
+          <w:sz w:val="20"/>
+          <w:szCs w:val="20"/>
+          <w:lang w:val="en-US"/>
+        </w:rPr>
+      </w:pPr>
+      <w:r>
+        <w:rPr>
+          <w:sz w:val="20"/>
+          <w:szCs w:val="20"/>
+          <w:lang w:val="en-US"/>
+        </w:rPr>
+        <w:t xml:space="preserve">In Grassland area cannot be changed, this is the intended </w:t>
+      </w:r>
+      <w:proofErr w:type="spellStart"/>
+      <w:proofErr w:type="gramStart"/>
+      <w:r>
+        <w:rPr>
+          <w:sz w:val="20"/>
+          <w:szCs w:val="20"/>
+          <w:lang w:val="en-US"/>
+        </w:rPr>
+        <w:t>behaviour</w:t>
+      </w:r>
+      <w:proofErr w:type="spellEnd"/>
+      <w:proofErr w:type="gramEnd"/>
+      <w:r>
+        <w:rPr>
+          <w:sz w:val="20"/>
+          <w:szCs w:val="20"/>
+          <w:lang w:val="en-US"/>
+        </w:rPr>
+        <w:t xml:space="preserve"> right? All three areas are the same, w and wo are pre-populated to area value. (area == </w:t>
+      </w:r>
+      <w:proofErr w:type="spellStart"/>
+      <w:r>
+        <w:rPr>
+          <w:sz w:val="20"/>
+          <w:szCs w:val="20"/>
+          <w:lang w:val="en-US"/>
+        </w:rPr>
+        <w:t>area_w</w:t>
+      </w:r>
+      <w:proofErr w:type="spellEnd"/>
+      <w:r>
+        <w:rPr>
+          <w:sz w:val="20"/>
+          <w:szCs w:val="20"/>
+          <w:lang w:val="en-US"/>
+        </w:rPr>
+        <w:t xml:space="preserve"> == </w:t>
+      </w:r>
+      <w:proofErr w:type="spellStart"/>
+      <w:r>
+        <w:rPr>
+          <w:sz w:val="20"/>
+          <w:szCs w:val="20"/>
+          <w:lang w:val="en-US"/>
+        </w:rPr>
+        <w:t>area_wo</w:t>
+      </w:r>
+      <w:proofErr w:type="spellEnd"/>
+      <w:r>
+        <w:rPr>
+          <w:sz w:val="20"/>
+          <w:szCs w:val="20"/>
+          <w:lang w:val="en-US"/>
+        </w:rPr>
+        <w:t>)</w:t>
+      </w:r>
+    </w:p>
+    <w:p>
+      <w:pPr>
+        <w:rPr>
+          <w:sz w:val="20"/>
+          <w:szCs w:val="20"/>
+          <w:lang w:val="en-US"/>
+        </w:rPr>
+      </w:pPr>
+    </w:p>
+    <w:p>
+      <w:pPr>
+        <w:rPr>
+          <w:sz w:val="36"/>
+          <w:szCs w:val="36"/>
+          <w:lang w:val="en-US"/>
+        </w:rPr>
+      </w:pPr>
+    </w:p>
+    <w:p>
+      <w:pPr>
+        <w:rPr>
           <w:sz w:val="20"/>
           <w:szCs w:val="20"/>
           <w:lang w:val="en-US"/>
@@ -536,15 +660,7 @@
           <w:szCs w:val="36"/>
           <w:lang w:val="en-US"/>
         </w:rPr>
-        <w:t xml:space="preserve">7. </w:t>
-      </w:r>
-      <w:r>
-        <w:rPr>
-          <w:sz w:val="36"/>
-          <w:szCs w:val="36"/>
-          <w:lang w:val="en-US"/>
-        </w:rPr>
-        <w:t>FISHERIES AND AQUACULTURE</w:t>
+        <w:t>7. FISHERIES AND AQUACULTURE</w:t>
       </w:r>
     </w:p>
     <w:p>
@@ -585,15 +701,7 @@
           <w:szCs w:val="20"/>
           <w:lang w:val="en-US"/>
         </w:rPr>
-        <w:t xml:space="preserve">cell </w:t>
-      </w:r>
-      <w:r>
-        <w:rPr>
-          <w:sz w:val="20"/>
-          <w:szCs w:val="20"/>
-          <w:lang w:val="en-US"/>
-        </w:rPr>
-        <w:t xml:space="preserve">M63 the formula refers to values in small scale fisheries, whereas for </w:t>
+        <w:t xml:space="preserve">cell M63 the formula refers to values in small scale fisheries, whereas for </w:t>
       </w:r>
       <w:proofErr w:type="spellStart"/>
       <w:r>

</xml_diff>